<commit_message>
feat(src/services/template/DocumentTemplateService.ts): update document generation to support new template fields and template adjustments (templates/surat-rekomendasi-beasiswa/surat-rekomendasi-beasiswa-template-v1.docx)
</commit_message>
<xml_diff>
--- a/templates/surat-rekomendasi-beasiswa/surat-rekomendasi-beasiswa-template-v1.docx
+++ b/templates/surat-rekomendasi-beasiswa/surat-rekomendasi-beasiswa-template-v1.docx
@@ -180,18 +180,15 @@
         </w:rPr>
         <w:t>{{nama_lengkap}}</w:t>
       </w:r>
-    </w:p>
-    <w:p>
-      <w:pPr>
-        <w:spacing w:before="120" w:line="276" w:lineRule="auto"/>
-        <w:ind w:left="708"/>
-        <w:rPr>
-          <w:rFonts w:ascii="Times New Roman" w:eastAsia="Times New Roman" w:hAnsi="Times New Roman" w:cs="Times New Roman"/>
-          <w:color w:val="000000"/>
-          <w:sz w:val="24"/>
-          <w:szCs w:val="24"/>
-        </w:rPr>
-      </w:pPr>
+      <w:r>
+        <w:rPr>
+          <w:rFonts w:ascii="Times New Roman" w:eastAsia="Times New Roman" w:hAnsi="Times New Roman" w:cs="Times New Roman"/>
+          <w:color w:val="000000"/>
+          <w:sz w:val="24"/>
+          <w:szCs w:val="24"/>
+        </w:rPr>
+        <w:br/>
+      </w:r>
       <w:r>
         <w:rPr>
           <w:rFonts w:ascii="Times New Roman" w:eastAsia="Times New Roman" w:hAnsi="Times New Roman" w:cs="Times New Roman"/>
@@ -1188,6 +1185,82 @@
           <w:szCs w:val="24"/>
         </w:rPr>
       </w:pPr>
+    </w:p>
+    <w:p>
+      <w:pPr>
+        <w:spacing w:before="0" w:line="276" w:lineRule="auto"/>
+        <w:rPr>
+          <w:rFonts w:ascii="Times New Roman" w:eastAsia="Times New Roman" w:hAnsi="Times New Roman" w:cs="Times New Roman"/>
+          <w:color w:val="000000"/>
+          <w:sz w:val="24"/>
+          <w:szCs w:val="24"/>
+        </w:rPr>
+      </w:pPr>
+    </w:p>
+    <w:p>
+      <w:pPr>
+        <w:spacing w:before="0" w:line="276" w:lineRule="auto"/>
+        <w:ind w:left="5102"/>
+        <w:rPr>
+          <w:rFonts w:ascii="Times New Roman" w:eastAsia="Times New Roman" w:hAnsi="Times New Roman" w:cs="Times New Roman"/>
+          <w:b/>
+          <w:bCs/>
+          <w:sz w:val="24"/>
+          <w:szCs w:val="24"/>
+          <w:u w:val="single"/>
+        </w:rPr>
+      </w:pPr>
+    </w:p>
+    <w:p>
+      <w:pPr>
+        <w:spacing w:before="0" w:line="276" w:lineRule="auto"/>
+        <w:ind w:left="5102"/>
+        <w:rPr>
+          <w:rFonts w:ascii="Times New Roman" w:eastAsia="Times New Roman" w:hAnsi="Times New Roman" w:cs="Times New Roman"/>
+          <w:b/>
+          <w:bCs/>
+          <w:sz w:val="24"/>
+          <w:szCs w:val="24"/>
+          <w:u w:val="single"/>
+        </w:rPr>
+      </w:pPr>
+    </w:p>
+    <w:p>
+      <w:pPr>
+        <w:spacing w:before="0" w:line="276" w:lineRule="auto"/>
+        <w:ind w:left="5102"/>
+        <w:rPr>
+          <w:rFonts w:ascii="Times New Roman" w:eastAsia="Times New Roman" w:hAnsi="Times New Roman" w:cs="Times New Roman"/>
+          <w:b/>
+          <w:bCs/>
+          <w:color w:val="000000"/>
+          <w:sz w:val="24"/>
+          <w:szCs w:val="24"/>
+          <w:u w:val="single"/>
+        </w:rPr>
+      </w:pPr>
+      <w:r>
+        <w:rPr>
+          <w:rFonts w:ascii="Times New Roman" w:eastAsia="Times New Roman" w:hAnsi="Times New Roman" w:cs="Times New Roman"/>
+          <w:b/>
+          <w:bCs/>
+          <w:sz w:val="24"/>
+          <w:szCs w:val="24"/>
+          <w:u w:val="single"/>
+        </w:rPr>
+        <w:t>{{nama_penandatangan}}</w:t>
+      </w:r>
+    </w:p>
+    <w:p>
+      <w:pPr>
+        <w:spacing w:before="0" w:line="276" w:lineRule="auto"/>
+        <w:ind w:left="5102"/>
+        <w:rPr>
+          <w:rFonts w:ascii="Times New Roman" w:eastAsia="Times New Roman" w:hAnsi="Times New Roman" w:cs="Times New Roman"/>
+          <w:sz w:val="24"/>
+          <w:szCs w:val="24"/>
+        </w:rPr>
+      </w:pPr>
       <w:r>
         <w:rPr>
           <w:rFonts w:ascii="Times New Roman" w:eastAsia="Times New Roman" w:hAnsi="Times New Roman" w:cs="Times New Roman"/>
@@ -1199,16 +1272,16 @@
         <mc:AlternateContent>
           <mc:Choice Requires="wps">
             <w:drawing>
-              <wp:anchor distT="0" distB="0" distL="114300" distR="114300" simplePos="0" relativeHeight="251661312" behindDoc="0" locked="0" layoutInCell="1" allowOverlap="1" wp14:anchorId="484FCCDD" wp14:editId="6E69342F">
+              <wp:anchor distT="0" distB="0" distL="114300" distR="114300" simplePos="0" relativeHeight="251661312" behindDoc="0" locked="0" layoutInCell="1" allowOverlap="1" wp14:anchorId="484FCCDD" wp14:editId="0E9A9CE3">
                 <wp:simplePos x="0" y="0"/>
                 <wp:positionH relativeFrom="margin">
                   <wp:align>left</wp:align>
                 </wp:positionH>
                 <wp:positionV relativeFrom="paragraph">
-                  <wp:posOffset>48847</wp:posOffset>
+                  <wp:posOffset>8552</wp:posOffset>
                 </wp:positionV>
-                <wp:extent cx="1080000" cy="1080000"/>
-                <wp:effectExtent l="0" t="0" r="6350" b="6350"/>
+                <wp:extent cx="359410" cy="360000"/>
+                <wp:effectExtent l="0" t="0" r="2540" b="2540"/>
                 <wp:wrapNone/>
                 <wp:docPr id="358686747" name="Text Box 12"/>
                 <wp:cNvGraphicFramePr/>
@@ -1219,7 +1292,7 @@
                       <wps:spPr>
                         <a:xfrm>
                           <a:off x="0" y="0"/>
-                          <a:ext cx="1080000" cy="1080000"/>
+                          <a:ext cx="359410" cy="360000"/>
                         </a:xfrm>
                         <a:prstGeom prst="rect">
                           <a:avLst/>
@@ -1297,7 +1370,7 @@
           </mc:Choice>
           <mc:Fallback>
             <w:pict>
-              <v:shape w14:anchorId="484FCCDD" id="Text Box 12" o:spid="_x0000_s1028" type="#_x0000_t202" style="position:absolute;margin-left:0;margin-top:3.85pt;width:85.05pt;height:85.05pt;z-index:251661312;visibility:visible;mso-wrap-style:square;mso-width-percent:0;mso-height-percent:0;mso-wrap-distance-left:9pt;mso-wrap-distance-top:0;mso-wrap-distance-right:9pt;mso-wrap-distance-bottom:0;mso-position-horizontal:left;mso-position-horizontal-relative:margin;mso-position-vertical:absolute;mso-position-vertical-relative:text;mso-width-percent:0;mso-height-percent:0;mso-width-relative:margin;mso-height-relative:margin;v-text-anchor:top" o:gfxdata="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" filled="f" stroked="f" strokeweight=".5pt">
+              <v:shape w14:anchorId="484FCCDD" id="Text Box 12" o:spid="_x0000_s1028" type="#_x0000_t202" style="position:absolute;left:0;text-align:left;margin-left:0;margin-top:.65pt;width:28.3pt;height:28.35pt;z-index:251661312;visibility:visible;mso-wrap-style:square;mso-width-percent:0;mso-height-percent:0;mso-wrap-distance-left:9pt;mso-wrap-distance-top:0;mso-wrap-distance-right:9pt;mso-wrap-distance-bottom:0;mso-position-horizontal:left;mso-position-horizontal-relative:margin;mso-position-vertical:absolute;mso-position-vertical-relative:text;mso-width-percent:0;mso-height-percent:0;mso-width-relative:margin;mso-height-relative:margin;v-text-anchor:top" o:gfxdata="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" filled="f" stroked="f" strokeweight=".5pt">
                 <v:textbox inset="0,0,0,0">
                   <w:txbxContent>
                     <w:p>
@@ -1352,82 +1425,6 @@
           </mc:Fallback>
         </mc:AlternateContent>
       </w:r>
-    </w:p>
-    <w:p>
-      <w:pPr>
-        <w:spacing w:before="0" w:line="276" w:lineRule="auto"/>
-        <w:rPr>
-          <w:rFonts w:ascii="Times New Roman" w:eastAsia="Times New Roman" w:hAnsi="Times New Roman" w:cs="Times New Roman"/>
-          <w:color w:val="000000"/>
-          <w:sz w:val="24"/>
-          <w:szCs w:val="24"/>
-        </w:rPr>
-      </w:pPr>
-    </w:p>
-    <w:p>
-      <w:pPr>
-        <w:spacing w:before="0" w:line="276" w:lineRule="auto"/>
-        <w:ind w:left="5102"/>
-        <w:rPr>
-          <w:rFonts w:ascii="Times New Roman" w:eastAsia="Times New Roman" w:hAnsi="Times New Roman" w:cs="Times New Roman"/>
-          <w:b/>
-          <w:bCs/>
-          <w:sz w:val="24"/>
-          <w:szCs w:val="24"/>
-          <w:u w:val="single"/>
-        </w:rPr>
-      </w:pPr>
-    </w:p>
-    <w:p>
-      <w:pPr>
-        <w:spacing w:before="0" w:line="276" w:lineRule="auto"/>
-        <w:ind w:left="5102"/>
-        <w:rPr>
-          <w:rFonts w:ascii="Times New Roman" w:eastAsia="Times New Roman" w:hAnsi="Times New Roman" w:cs="Times New Roman"/>
-          <w:b/>
-          <w:bCs/>
-          <w:sz w:val="24"/>
-          <w:szCs w:val="24"/>
-          <w:u w:val="single"/>
-        </w:rPr>
-      </w:pPr>
-    </w:p>
-    <w:p>
-      <w:pPr>
-        <w:spacing w:before="0" w:line="276" w:lineRule="auto"/>
-        <w:ind w:left="5102"/>
-        <w:rPr>
-          <w:rFonts w:ascii="Times New Roman" w:eastAsia="Times New Roman" w:hAnsi="Times New Roman" w:cs="Times New Roman"/>
-          <w:b/>
-          <w:bCs/>
-          <w:color w:val="000000"/>
-          <w:sz w:val="24"/>
-          <w:szCs w:val="24"/>
-          <w:u w:val="single"/>
-        </w:rPr>
-      </w:pPr>
-      <w:r>
-        <w:rPr>
-          <w:rFonts w:ascii="Times New Roman" w:eastAsia="Times New Roman" w:hAnsi="Times New Roman" w:cs="Times New Roman"/>
-          <w:b/>
-          <w:bCs/>
-          <w:sz w:val="24"/>
-          <w:szCs w:val="24"/>
-          <w:u w:val="single"/>
-        </w:rPr>
-        <w:t>{{nama_penandatangan}}</w:t>
-      </w:r>
-    </w:p>
-    <w:p>
-      <w:pPr>
-        <w:spacing w:before="0" w:line="276" w:lineRule="auto"/>
-        <w:ind w:left="5102"/>
-        <w:rPr>
-          <w:rFonts w:ascii="Times New Roman" w:eastAsia="Times New Roman" w:hAnsi="Times New Roman" w:cs="Times New Roman"/>
-          <w:sz w:val="24"/>
-          <w:szCs w:val="24"/>
-        </w:rPr>
-      </w:pPr>
       <w:r>
         <w:rPr>
           <w:rFonts w:ascii="Times New Roman" w:eastAsia="Times New Roman" w:hAnsi="Times New Roman" w:cs="Times New Roman"/>

</xml_diff>

<commit_message>
chore(template): update surat rekomendasi beasiswa docx template
</commit_message>
<xml_diff>
--- a/templates/surat-rekomendasi-beasiswa/surat-rekomendasi-beasiswa-template-v1.docx
+++ b/templates/surat-rekomendasi-beasiswa/surat-rekomendasi-beasiswa-template-v1.docx
@@ -601,7 +601,7 @@
           <w:szCs w:val="24"/>
           <w:u w:val="single"/>
         </w:rPr>
-        <w:t xml:space="preserve">Pengajuan Beasiswa </w:t>
+        <w:t xml:space="preserve">Pengajuan </w:t>
       </w:r>
       <w:r>
         <w:rPr>
@@ -837,7 +837,7 @@
         <mc:AlternateContent>
           <mc:Choice Requires="wps">
             <w:drawing>
-              <wp:anchor distT="0" distB="0" distL="114300" distR="114300" simplePos="0" relativeHeight="251659264" behindDoc="0" locked="0" layoutInCell="1" allowOverlap="1" wp14:anchorId="7A08B378" wp14:editId="25479A6B">
+              <wp:anchor distT="0" distB="0" distL="114300" distR="114300" simplePos="0" relativeHeight="251659264" behindDoc="0" locked="0" layoutInCell="1" allowOverlap="1" wp14:anchorId="7A08B378" wp14:editId="157AEE41">
                 <wp:simplePos x="0" y="0"/>
                 <wp:positionH relativeFrom="column">
                   <wp:posOffset>3269615</wp:posOffset>
@@ -845,8 +845,8 @@
                 <wp:positionV relativeFrom="paragraph">
                   <wp:posOffset>276860</wp:posOffset>
                 </wp:positionV>
-                <wp:extent cx="1079500" cy="1080000"/>
-                <wp:effectExtent l="0" t="0" r="6350" b="6350"/>
+                <wp:extent cx="720000" cy="720000"/>
+                <wp:effectExtent l="0" t="0" r="4445" b="4445"/>
                 <wp:wrapNone/>
                 <wp:docPr id="384080058" name="Text Box 4"/>
                 <wp:cNvGraphicFramePr/>
@@ -857,7 +857,7 @@
                       <wps:spPr>
                         <a:xfrm>
                           <a:off x="0" y="0"/>
-                          <a:ext cx="1079500" cy="1080000"/>
+                          <a:ext cx="720000" cy="720000"/>
                         </a:xfrm>
                         <a:prstGeom prst="rect">
                           <a:avLst/>
@@ -914,7 +914,7 @@
                 <v:stroke joinstyle="miter"/>
                 <v:path gradientshapeok="t" o:connecttype="rect"/>
               </v:shapetype>
-              <v:shape id="Text Box 4" o:spid="_x0000_s1026" type="#_x0000_t202" style="position:absolute;left:0;text-align:left;margin-left:257.45pt;margin-top:21.8pt;width:85pt;height:85.05pt;z-index:251659264;visibility:visible;mso-wrap-style:square;mso-width-percent:0;mso-height-percent:0;mso-wrap-distance-left:9pt;mso-wrap-distance-top:0;mso-wrap-distance-right:9pt;mso-wrap-distance-bottom:0;mso-position-horizontal:absolute;mso-position-horizontal-relative:text;mso-position-vertical:absolute;mso-position-vertical-relative:text;mso-width-percent:0;mso-height-percent:0;mso-width-relative:margin;mso-height-relative:margin;v-text-anchor:top" o:gfxdata="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" filled="f" stroked="f" strokeweight=".5pt">
+              <v:shape id="Text Box 4" o:spid="_x0000_s1026" type="#_x0000_t202" style="position:absolute;left:0;text-align:left;margin-left:257.45pt;margin-top:21.8pt;width:56.7pt;height:56.7pt;z-index:251659264;visibility:visible;mso-wrap-style:square;mso-width-percent:0;mso-height-percent:0;mso-wrap-distance-left:9pt;mso-wrap-distance-top:0;mso-wrap-distance-right:9pt;mso-wrap-distance-bottom:0;mso-position-horizontal:absolute;mso-position-horizontal-relative:text;mso-position-vertical:absolute;mso-position-vertical-relative:text;mso-width-percent:0;mso-height-percent:0;mso-width-relative:margin;mso-height-relative:margin;v-text-anchor:top" o:gfxdata="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" filled="f" stroked="f" strokeweight=".5pt">
                 <v:textbox inset="0,0,0,0">
                   <w:txbxContent>
                     <w:p>
@@ -953,7 +953,7 @@
         <mc:AlternateContent>
           <mc:Choice Requires="wps">
             <w:drawing>
-              <wp:anchor distT="0" distB="0" distL="114300" distR="114300" simplePos="0" relativeHeight="251660288" behindDoc="0" locked="0" layoutInCell="1" allowOverlap="1" wp14:anchorId="77D5957B" wp14:editId="57AC9E8E">
+              <wp:anchor distT="0" distB="0" distL="114300" distR="114300" simplePos="0" relativeHeight="251660288" behindDoc="0" locked="0" layoutInCell="1" allowOverlap="1" wp14:anchorId="77D5957B" wp14:editId="31486DA7">
                 <wp:simplePos x="0" y="0"/>
                 <wp:positionH relativeFrom="column">
                   <wp:posOffset>4392295</wp:posOffset>
@@ -961,8 +961,8 @@
                 <wp:positionV relativeFrom="paragraph">
                   <wp:posOffset>259715</wp:posOffset>
                 </wp:positionV>
-                <wp:extent cx="1079500" cy="1080000"/>
-                <wp:effectExtent l="0" t="0" r="6350" b="6350"/>
+                <wp:extent cx="720000" cy="720000"/>
+                <wp:effectExtent l="0" t="0" r="4445" b="4445"/>
                 <wp:wrapNone/>
                 <wp:docPr id="848224343" name="Text Box 5"/>
                 <wp:cNvGraphicFramePr/>
@@ -973,7 +973,7 @@
                       <wps:spPr>
                         <a:xfrm>
                           <a:off x="0" y="0"/>
-                          <a:ext cx="1079500" cy="1080000"/>
+                          <a:ext cx="720000" cy="720000"/>
                         </a:xfrm>
                         <a:prstGeom prst="rect">
                           <a:avLst/>
@@ -1039,7 +1039,7 @@
           </mc:Choice>
           <mc:Fallback>
             <w:pict>
-              <v:shape w14:anchorId="77D5957B" id="Text Box 5" o:spid="_x0000_s1027" type="#_x0000_t202" style="position:absolute;left:0;text-align:left;margin-left:345.85pt;margin-top:20.45pt;width:85pt;height:85.05pt;z-index:251660288;visibility:visible;mso-wrap-style:square;mso-width-percent:0;mso-height-percent:0;mso-wrap-distance-left:9pt;mso-wrap-distance-top:0;mso-wrap-distance-right:9pt;mso-wrap-distance-bottom:0;mso-position-horizontal:absolute;mso-position-horizontal-relative:text;mso-position-vertical:absolute;mso-position-vertical-relative:text;mso-width-percent:0;mso-height-percent:0;mso-width-relative:margin;mso-height-relative:margin;v-text-anchor:top" o:gfxdata="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" filled="f" stroked="f" strokeweight=".5pt">
+              <v:shape w14:anchorId="77D5957B" id="Text Box 5" o:spid="_x0000_s1027" type="#_x0000_t202" style="position:absolute;left:0;text-align:left;margin-left:345.85pt;margin-top:20.45pt;width:56.7pt;height:56.7pt;z-index:251660288;visibility:visible;mso-wrap-style:square;mso-width-percent:0;mso-height-percent:0;mso-wrap-distance-left:9pt;mso-wrap-distance-top:0;mso-wrap-distance-right:9pt;mso-wrap-distance-bottom:0;mso-position-horizontal:absolute;mso-position-horizontal-relative:text;mso-position-vertical:absolute;mso-position-vertical-relative:text;mso-width-percent:0;mso-height-percent:0;mso-width-relative:margin;mso-height-relative:margin;v-text-anchor:top" o:gfxdata="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" filled="f" stroked="f" strokeweight=".5pt">
                 <v:textbox inset="0,0,0,0">
                   <w:txbxContent>
                     <w:p>
@@ -1191,32 +1191,6 @@
         <w:spacing w:before="0" w:line="276" w:lineRule="auto"/>
         <w:rPr>
           <w:rFonts w:ascii="Times New Roman" w:eastAsia="Times New Roman" w:hAnsi="Times New Roman" w:cs="Times New Roman"/>
-          <w:color w:val="000000"/>
-          <w:sz w:val="24"/>
-          <w:szCs w:val="24"/>
-        </w:rPr>
-      </w:pPr>
-    </w:p>
-    <w:p>
-      <w:pPr>
-        <w:spacing w:before="0" w:line="276" w:lineRule="auto"/>
-        <w:ind w:left="5102"/>
-        <w:rPr>
-          <w:rFonts w:ascii="Times New Roman" w:eastAsia="Times New Roman" w:hAnsi="Times New Roman" w:cs="Times New Roman"/>
-          <w:b/>
-          <w:bCs/>
-          <w:sz w:val="24"/>
-          <w:szCs w:val="24"/>
-          <w:u w:val="single"/>
-        </w:rPr>
-      </w:pPr>
-    </w:p>
-    <w:p>
-      <w:pPr>
-        <w:spacing w:before="0" w:line="276" w:lineRule="auto"/>
-        <w:ind w:left="5102"/>
-        <w:rPr>
-          <w:rFonts w:ascii="Times New Roman" w:eastAsia="Times New Roman" w:hAnsi="Times New Roman" w:cs="Times New Roman"/>
           <w:b/>
           <w:bCs/>
           <w:sz w:val="24"/>
@@ -1272,7 +1246,7 @@
         <mc:AlternateContent>
           <mc:Choice Requires="wps">
             <w:drawing>
-              <wp:anchor distT="0" distB="0" distL="114300" distR="114300" simplePos="0" relativeHeight="251661312" behindDoc="0" locked="0" layoutInCell="1" allowOverlap="1" wp14:anchorId="484FCCDD" wp14:editId="0E9A9CE3">
+              <wp:anchor distT="0" distB="0" distL="114300" distR="114300" simplePos="0" relativeHeight="251661312" behindDoc="0" locked="0" layoutInCell="1" allowOverlap="1" wp14:anchorId="484FCCDD" wp14:editId="1F9A0E39">
                 <wp:simplePos x="0" y="0"/>
                 <wp:positionH relativeFrom="margin">
                   <wp:align>left</wp:align>
@@ -1280,8 +1254,8 @@
                 <wp:positionV relativeFrom="paragraph">
                   <wp:posOffset>8552</wp:posOffset>
                 </wp:positionV>
-                <wp:extent cx="359410" cy="360000"/>
-                <wp:effectExtent l="0" t="0" r="2540" b="2540"/>
+                <wp:extent cx="720000" cy="720000"/>
+                <wp:effectExtent l="0" t="0" r="4445" b="4445"/>
                 <wp:wrapNone/>
                 <wp:docPr id="358686747" name="Text Box 12"/>
                 <wp:cNvGraphicFramePr/>
@@ -1292,7 +1266,7 @@
                       <wps:spPr>
                         <a:xfrm>
                           <a:off x="0" y="0"/>
-                          <a:ext cx="359410" cy="360000"/>
+                          <a:ext cx="720000" cy="720000"/>
                         </a:xfrm>
                         <a:prstGeom prst="rect">
                           <a:avLst/>
@@ -1370,7 +1344,7 @@
           </mc:Choice>
           <mc:Fallback>
             <w:pict>
-              <v:shape w14:anchorId="484FCCDD" id="Text Box 12" o:spid="_x0000_s1028" type="#_x0000_t202" style="position:absolute;left:0;text-align:left;margin-left:0;margin-top:.65pt;width:28.3pt;height:28.35pt;z-index:251661312;visibility:visible;mso-wrap-style:square;mso-width-percent:0;mso-height-percent:0;mso-wrap-distance-left:9pt;mso-wrap-distance-top:0;mso-wrap-distance-right:9pt;mso-wrap-distance-bottom:0;mso-position-horizontal:left;mso-position-horizontal-relative:margin;mso-position-vertical:absolute;mso-position-vertical-relative:text;mso-width-percent:0;mso-height-percent:0;mso-width-relative:margin;mso-height-relative:margin;v-text-anchor:top" o:gfxdata="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" filled="f" stroked="f" strokeweight=".5pt">
+              <v:shape w14:anchorId="484FCCDD" id="Text Box 12" o:spid="_x0000_s1028" type="#_x0000_t202" style="position:absolute;left:0;text-align:left;margin-left:0;margin-top:.65pt;width:56.7pt;height:56.7pt;z-index:251661312;visibility:visible;mso-wrap-style:square;mso-width-percent:0;mso-height-percent:0;mso-wrap-distance-left:9pt;mso-wrap-distance-top:0;mso-wrap-distance-right:9pt;mso-wrap-distance-bottom:0;mso-position-horizontal:left;mso-position-horizontal-relative:margin;mso-position-vertical:absolute;mso-position-vertical-relative:text;mso-width-percent:0;mso-height-percent:0;mso-width-relative:margin;mso-height-relative:margin;v-text-anchor:top" o:gfxdata="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" filled="f" stroked="f" strokeweight=".5pt">
                 <v:textbox inset="0,0,0,0">
                   <w:txbxContent>
                     <w:p>

</xml_diff>

<commit_message>
fix(template): patch beasiswa template to merge split tags
</commit_message>
<xml_diff>
--- a/templates/surat-rekomendasi-beasiswa/surat-rekomendasi-beasiswa-template-v1.docx
+++ b/templates/surat-rekomendasi-beasiswa/surat-rekomendasi-beasiswa-template-v1.docx
@@ -431,23 +431,7 @@
           <w:sz w:val="24"/>
           <w:szCs w:val="24"/>
         </w:rPr>
-        <w:t xml:space="preserve">: </w:t>
-      </w:r>
-      <w:r>
-        <w:rPr>
-          <w:rFonts w:ascii="Times New Roman" w:eastAsia="Times New Roman" w:hAnsi="Times New Roman" w:cs="Times New Roman"/>
-          <w:sz w:val="24"/>
-          <w:szCs w:val="24"/>
-        </w:rPr>
-        <w:t>{{program_studi}</w:t>
-      </w:r>
-      <w:r>
-        <w:rPr>
-          <w:rFonts w:ascii="Times New Roman" w:eastAsia="Times New Roman" w:hAnsi="Times New Roman" w:cs="Times New Roman"/>
-          <w:sz w:val="24"/>
-          <w:szCs w:val="24"/>
-        </w:rPr>
-        <w:t>}</w:t>
+        <w:t>: {{program_studi}}</w:t>
       </w:r>
     </w:p>
     <w:p>
@@ -1014,25 +998,7 @@
                                 <w:sz w:val="24"/>
                                 <w:szCs w:val="24"/>
                               </w:rPr>
-                              <w:t>{</w:t>
-                            </w:r>
-                            <w:r>
-                              <w:rPr>
-                                <w:rFonts w:ascii="Times New Roman" w:eastAsia="Times New Roman" w:hAnsi="Times New Roman" w:cs="Times New Roman"/>
-                                <w:color w:val="000000"/>
-                                <w:sz w:val="24"/>
-                                <w:szCs w:val="24"/>
-                              </w:rPr>
-                              <w:t>{%stamp_image}</w:t>
-                            </w:r>
-                            <w:r>
-                              <w:rPr>
-                                <w:rFonts w:ascii="Times New Roman" w:eastAsia="Times New Roman" w:hAnsi="Times New Roman" w:cs="Times New Roman"/>
-                                <w:color w:val="000000"/>
-                                <w:sz w:val="24"/>
-                                <w:szCs w:val="24"/>
-                              </w:rPr>
-                              <w:t>}</w:t>
+                              <w:t>{{%stamp_image}}</w:t>
                             </w:r>
                           </w:p>
                         </w:txbxContent>
@@ -1071,25 +1037,7 @@
                           <w:sz w:val="24"/>
                           <w:szCs w:val="24"/>
                         </w:rPr>
-                        <w:t>{</w:t>
-                      </w:r>
-                      <w:r>
-                        <w:rPr>
-                          <w:rFonts w:ascii="Times New Roman" w:eastAsia="Times New Roman" w:hAnsi="Times New Roman" w:cs="Times New Roman"/>
-                          <w:color w:val="000000"/>
-                          <w:sz w:val="24"/>
-                          <w:szCs w:val="24"/>
-                        </w:rPr>
-                        <w:t>{%stamp_image}</w:t>
-                      </w:r>
-                      <w:r>
-                        <w:rPr>
-                          <w:rFonts w:ascii="Times New Roman" w:eastAsia="Times New Roman" w:hAnsi="Times New Roman" w:cs="Times New Roman"/>
-                          <w:color w:val="000000"/>
-                          <w:sz w:val="24"/>
-                          <w:szCs w:val="24"/>
-                        </w:rPr>
-                        <w:t>}</w:t>
+                        <w:t>{{%stamp_image}}</w:t>
                       </w:r>
                     </w:p>
                   </w:txbxContent>
@@ -1272,23 +1220,7 @@
                                 <w:sz w:val="24"/>
                                 <w:szCs w:val="24"/>
                               </w:rPr>
-                              <w:t>{</w:t>
-                            </w:r>
-                            <w:r>
-                              <w:rPr>
-                                <w:rFonts w:ascii="Times New Roman" w:eastAsia="Times New Roman" w:hAnsi="Times New Roman" w:cs="Times New Roman"/>
-                                <w:sz w:val="24"/>
-                                <w:szCs w:val="24"/>
-                              </w:rPr>
-                              <w:t>{%qr_code}</w:t>
-                            </w:r>
-                            <w:r>
-                              <w:rPr>
-                                <w:rFonts w:ascii="Times New Roman" w:eastAsia="Times New Roman" w:hAnsi="Times New Roman" w:cs="Times New Roman"/>
-                                <w:sz w:val="24"/>
-                                <w:szCs w:val="24"/>
-                              </w:rPr>
-                              <w:t>}</w:t>
+                              <w:t>{{%qr_code}}</w:t>
                             </w:r>
                           </w:p>
                           <w:p>
@@ -1341,23 +1273,7 @@
                           <w:sz w:val="24"/>
                           <w:szCs w:val="24"/>
                         </w:rPr>
-                        <w:t>{</w:t>
-                      </w:r>
-                      <w:r>
-                        <w:rPr>
-                          <w:rFonts w:ascii="Times New Roman" w:eastAsia="Times New Roman" w:hAnsi="Times New Roman" w:cs="Times New Roman"/>
-                          <w:sz w:val="24"/>
-                          <w:szCs w:val="24"/>
-                        </w:rPr>
-                        <w:t>{%qr_code}</w:t>
-                      </w:r>
-                      <w:r>
-                        <w:rPr>
-                          <w:rFonts w:ascii="Times New Roman" w:eastAsia="Times New Roman" w:hAnsi="Times New Roman" w:cs="Times New Roman"/>
-                          <w:sz w:val="24"/>
-                          <w:szCs w:val="24"/>
-                        </w:rPr>
-                        <w:t>}</w:t>
+                        <w:t>{{%qr_code}}</w:t>
                       </w:r>
                     </w:p>
                     <w:p>

</xml_diff>